<commit_message>
Log Dr. Rey's written confirmation ('Correct.') of the full revision plan and timeline — the governing agreement is now confirmed in writing
Co-Authored-By: Claude Fable 5 <noreply@anthropic.com>
Claude-Session: https://claude.ai/code/session_019uQWfMoV11me5yJ6LYRtPv
</commit_message>
<xml_diff>
--- a/dba/correspondence/2026-07-24_Rey_status_links_nextsteps.docx
+++ b/dba/correspondence/2026-07-24_Rey_status_links_nextsteps.docx
@@ -96,6 +96,28 @@
       </w:r>
       <w:r>
         <w:t>, his convenience; minor tweaks only (broadened population + 2–3 AI boxes, both his own directives). No formal drafting before that conversation.</w:t>
+      </w:r>
+    </w:p>
+    <w:p>
+      <w:pPr>
+        <w:pStyle w:val="Heading2"/>
+      </w:pPr>
+      <w:r>
+        <w:t>✅ CONFIRMATION RECEIVED (logged Jul 24)</w:t>
+      </w:r>
+    </w:p>
+    <w:p>
+      <w:r>
+        <w:t xml:space="preserve">Dr. Rey replied to the Jul 23 confirmation email with: </w:t>
+      </w:r>
+      <w:r>
+        <w:rPr>
+          <w:b/>
+        </w:rPr>
+        <w:t>"Correct."</w:t>
+      </w:r>
+      <w:r>
+        <w:t xml:space="preserve"> — written sign-off on the full plan: Ch. 1 significant revision, Ch. 2–3 untouched, Ch. 4–6 rewrites as described, submission Friday/Sunday (Tuesday hard), simulated-data exercise after submission. The reply-with-attachments (this file's email) responds within that confirmed thread.</w:t>
       </w:r>
     </w:p>
     <w:sectPr>

</xml_diff>